<commit_message>
MOON-33 | fix doc
</commit_message>
<xml_diff>
--- a/report/bao-cao-do-an.docx
+++ b/report/bao-cao-do-an.docx
@@ -851,7 +851,7 @@
         <w:t xml:space="preserve"> </w:t>
       </w:r>
       <w:r>
-        <w:t xml:space="preserve">— Trình bày quá trình triển khai backend, frontend, dịch vụ AI và hệ thống tổng thể; đánh giá kết quả đạt được.</w:t>
+        <w:t xml:space="preserve">— Trình bày quá trình triển khai backend, frontend, module chatbot AI và hệ thống tổng thể; đánh giá kết quả đạt được.</w:t>
       </w:r>
     </w:p>
     <w:p>
@@ -1647,7 +1647,7 @@
         </w:numPr>
       </w:pPr>
       <w:r>
-        <w:t xml:space="preserve">3.1 Triển khai pipeline RAG và dịch vụ AI</w:t>
+        <w:t xml:space="preserve">3.1 Triển khai pipeline RAG và chatbot AI</w:t>
       </w:r>
     </w:p>
     <w:p>
@@ -4451,7 +4451,7 @@
         <w:t xml:space="preserve"> </w:t>
       </w:r>
       <w:r>
-        <w:t xml:space="preserve">là thành phần nhận yêu cầu, xử lý logic nghiệp vụ và trả về kết quả. Moon Store sử dụng NestJS làm server chính và một dịch vụ Python riêng để xử lý chatbot AI.</w:t>
+        <w:t xml:space="preserve">là thành phần nhận yêu cầu, xử lý logic nghiệp vụ và trả về kết quả. Moon Store sử dụng NestJS làm server chính; chatbot AI được triển khai như một module nằm trong chính backend NestJS (gọi Google Gemini API), không tách thành dịch vụ riêng.</w:t>
       </w:r>
     </w:p>
     <w:p>
@@ -5247,7 +5247,7 @@
         <w:pStyle w:val="FirstParagraph"/>
       </w:pPr>
       <w:r>
-        <w:t xml:space="preserve">Google Generative AI (Gemini) cung cấp quyền truy cập vào các mô hình ngôn ngữ lớn và mô hình embedding của Google thông qua API. Trong Moon Store, dịch vụ AI sử dụng:</w:t>
+        <w:t xml:space="preserve">Google Generative AI (Gemini) cung cấp quyền truy cập vào các mô hình ngôn ngữ lớn và mô hình embedding của Google thông qua API. Trong Moon Store, module chatbot AI sử dụng:</w:t>
       </w:r>
     </w:p>
     <w:p>
@@ -5334,7 +5334,7 @@
         <w:pStyle w:val="FirstParagraph"/>
       </w:pPr>
       <w:r>
-        <w:t xml:space="preserve">Docker là nền tảng container hóa cho phép đóng gói ứng dụng cùng toàn bộ dependencies vào một container độc lập. Docker Compose cho phép định nghĩa và khởi chạy nhiều container (frontend, backend, MySQL, AI service) chỉ bằng một file cấu hình</w:t>
+        <w:t xml:space="preserve">Docker là nền tảng container hóa cho phép đóng gói ứng dụng cùng toàn bộ dependencies vào một container độc lập. Docker Compose cho phép định nghĩa và khởi chạy nhiều container (frontend, backend, MySQL) chỉ bằng một file cấu hình</w:t>
       </w:r>
       <w:r>
         <w:t xml:space="preserve"> </w:t>
@@ -11065,7 +11065,7 @@
         <w:pStyle w:val="BodyText"/>
       </w:pPr>
       <w:r>
-        <w:t xml:space="preserve">Luồng chatbot: User gửi câu hỏi → AI Service tạo embedding câu hỏi qua Google Embeddings → Tính cosine similarity với vector sản phẩm trong MySQL, lấy top-K sản phẩm liên quan → Ghép context + câu hỏi + lịch sử thành prompt → Gọi Gemini 2.5 → Trả về câu trả lời dạng streaming (SSE) cho user.</w:t>
+        <w:t xml:space="preserve">Luồng chatbot: User gửi câu hỏi → Module ai-chat (NestJS) tạo embedding câu hỏi qua Google Embeddings → Tính cosine similarity với vector sản phẩm trong MySQL, lấy top-K sản phẩm liên quan → Ghép context + câu hỏi + lịch sử thành prompt → Gọi Gemini 2.5 → Trả về câu trả lời dạng streaming (SSE) cho user.</w:t>
       </w:r>
     </w:p>
     <w:p>
@@ -18071,7 +18071,7 @@
         <w:pStyle w:val="FirstParagraph"/>
       </w:pPr>
       <w:r>
-        <w:t xml:space="preserve">Chương 3 đã trình bày chi tiết quá trình triển khai toàn bộ hệ thống Moon Store, từ pipeline RAG của dịch vụ AI đến backend NestJS và frontend React. Kết quả kiểm thử cho thấy hệ thống đáp ứng tốt các mục tiêu đề ra: chatbot đạt độ chính xác 89%, thời gian phản hồi đạt yêu cầu, và 100% chức năng nghiệp vụ hoạt động đúng theo thiết kế.</w:t>
+        <w:t xml:space="preserve">Chương 3 đã trình bày chi tiết quá trình triển khai toàn bộ hệ thống Moon Store, từ pipeline RAG của module chatbot AI đến backend NestJS và frontend React. Kết quả kiểm thử cho thấy hệ thống đáp ứng tốt các mục tiêu đề ra: chatbot đạt độ chính xác 89%, thời gian phản hồi đạt yêu cầu, và 100% chức năng nghiệp vụ hoạt động đúng theo thiết kế.</w:t>
       </w:r>
     </w:p>
     <w:p>
@@ -18215,7 +18215,7 @@
         </w:numPr>
       </w:pPr>
       <w:r>
-        <w:t xml:space="preserve">Đề xuất mô hình kiến trúc tách biệt AI service khỏi backend nghiệp vụ, cho phép nâng cấp độc lập từng thành phần.</w:t>
+        <w:t xml:space="preserve">Đề xuất mô hình kiến trúc tổ chức chatbot AI thành module riêng trong backend, tách biệt logic RAG khỏi nghiệp vụ bán hàng để dễ bảo trì và nâng cấp.</w:t>
       </w:r>
     </w:p>
     <w:p>

</xml_diff>